<commit_message>
Hypothèse d'accélération et de freinage déclarée (question Vincent)
T_base intègre dx/min(v_geo, bande) avec changements de vitesse instantanés :
désormais dit explicitement en §2.1 (absorption par les 5 min/arrêt et les blocs
urbains figés ; biais favorable sur les transitions interurbaines, couvert par la
marge, chiffrage fin renvoyé à l'étude de circulation) et ajouté au hors-périmètre.

Co-Authored-By: Claude Fable 5 <noreply@anthropic.com>
</commit_message>
<xml_diff>
--- a/livrables/rapport_corridor.docx
+++ b/livrables/rapport_corridor.docx
@@ -1366,6 +1366,90 @@
           <w:b/>
           <w:bCs/>
         </w:rPr>
+        <w:t xml:space="preserve">Hypothèse d’accélération et de freinage, déclarée.</w:t>
+      </w:r>
+      <w:r>
+        <w:t xml:space="preserve"> </w:t>
+      </w:r>
+      <w:r>
+        <w:t xml:space="preserve">L’intégration traite les</w:t>
+      </w:r>
+      <w:r>
+        <w:t xml:space="preserve"> </w:t>
+      </w:r>
+      <w:r>
+        <w:t xml:space="preserve">changements de vitesse comme instantanés : aucun profil d’accélération ni de freinage</w:t>
+      </w:r>
+      <w:r>
+        <w:t xml:space="preserve"> </w:t>
+      </w:r>
+      <w:r>
+        <w:t xml:space="preserve">n’est modélisé. Là où cette simplification joue, son traitement est le suivant. Autour</w:t>
+      </w:r>
+      <w:r>
+        <w:t xml:space="preserve"> </w:t>
+      </w:r>
+      <w:r>
+        <w:t xml:space="preserve">des arrêts, les phases d’accélération et de freinage sont absorbées par la</w:t>
+      </w:r>
+      <w:r>
+        <w:t xml:space="preserve"> </w:t>
+      </w:r>
+      <w:r>
+        <w:t xml:space="preserve">normalisation de cinq minutes par arrêt, et la borne mesurée du pilote de 2025 (7,5 à</w:t>
+      </w:r>
+      <w:r>
+        <w:t xml:space="preserve"> </w:t>
+      </w:r>
+      <w:r>
+        <w:t xml:space="preserve">10 minutes par arrêt évité, phases comprises) est testée en sensibilité à la</w:t>
+      </w:r>
+      <w:r>
+        <w:t xml:space="preserve"> </w:t>
+      </w:r>
+      <w:r>
+        <w:t xml:space="preserve">section 7. Dans les blocs urbains, les minutes figées viennent de l’horaire réel, qui</w:t>
+      </w:r>
+      <w:r>
+        <w:t xml:space="preserve"> </w:t>
+      </w:r>
+      <w:r>
+        <w:t xml:space="preserve">contient déjà les accélérations terminales. Reste l’interurbain : un train réel ne</w:t>
+      </w:r>
+      <w:r>
+        <w:t xml:space="preserve"> </w:t>
+      </w:r>
+      <w:r>
+        <w:t xml:space="preserve">profite pas pleinement d’un segment rapide court coincé entre deux courbes lentes,</w:t>
+      </w:r>
+      <w:r>
+        <w:t xml:space="preserve"> </w:t>
+      </w:r>
+      <w:r>
+        <w:t xml:space="preserve">et sur ces transitions le temps de base est légèrement favorable au train. Ce poste</w:t>
+      </w:r>
+      <w:r>
+        <w:t xml:space="preserve"> </w:t>
+      </w:r>
+      <w:r>
+        <w:t xml:space="preserve">est couvert par la fourchette de marge, et son chiffrage fin (profils de traction</w:t>
+      </w:r>
+      <w:r>
+        <w:t xml:space="preserve"> </w:t>
+      </w:r>
+      <w:r>
+        <w:t xml:space="preserve">réels, freinage) relève de la simulation de circulation recommandée en conclusion.</w:t>
+      </w:r>
+    </w:p>
+    <w:p>
+      <w:pPr>
+        <w:pStyle w:val="BodyText"/>
+      </w:pPr>
+      <w:r>
+        <w:rPr>
+          <w:b/>
+          <w:bCs/>
+        </w:rPr>
         <w:t xml:space="preserve">Vitesse géométrique</w:t>
       </w:r>
       <w:r>
@@ -1975,7 +2059,19 @@
         <w:pStyle w:val="FirstParagraph"/>
       </w:pPr>
       <w:r>
-        <w:t xml:space="preserve">La conception par site (clothoïdes, raccordements), le cantonnement fin, la simulation de</w:t>
+        <w:t xml:space="preserve">La conception par site (clothoïdes, raccordements), les profils d’accélération et de</w:t>
+      </w:r>
+      <w:r>
+        <w:t xml:space="preserve"> </w:t>
+      </w:r>
+      <w:r>
+        <w:t xml:space="preserve">freinage (changements de vitesse traités comme instantanés, hypothèse déclarée en</w:t>
+      </w:r>
+      <w:r>
+        <w:t xml:space="preserve"> </w:t>
+      </w:r>
+      <w:r>
+        <w:t xml:space="preserve">section 2.1), le cantonnement fin, la simulation de</w:t>
       </w:r>
       <w:r>
         <w:t xml:space="preserve"> </w:t>

</xml_diff>